<commit_message>
Ч.8: актуальний server-side fallback для Fable 5 (fallbacks: default, бета 2026-07-01)
Звірено з живим migration-guide 2026-08-21. Старий варіант (ручний список моделей)
замінено на рекомендований режим, що добирає модель за категорією відмови.

Co-Authored-By: Claude Opus 5 <noreply@anthropic.com>
</commit_message>
<xml_diff>
--- a/promt-inzhiniring-haiku-kurs.docx
+++ b/promt-inzhiniring-haiku-kurs.docx
@@ -23255,7 +23255,34 @@
         <w:t xml:space="preserve"> </w:t>
       </w:r>
       <w:r>
-        <w:t xml:space="preserve">(класифікатори безпеки) — у продакшені додай fallback на Opus 4.8.</w:t>
+        <w:t xml:space="preserve">(класифікатори безпеки). У продакшені став server-side fallback: актуальний спосіб (звірено 2026-08) —</w:t>
+      </w:r>
+      <w:r>
+        <w:t xml:space="preserve"> </w:t>
+      </w:r>
+      <w:r>
+        <w:rPr>
+          <w:rStyle w:val="VerbatimChar"/>
+        </w:rPr>
+        <w:t xml:space="preserve">fallbacks: "default"</w:t>
+      </w:r>
+      <w:r>
+        <w:t xml:space="preserve"> </w:t>
+      </w:r>
+      <w:r>
+        <w:t xml:space="preserve">з бета-хедером</w:t>
+      </w:r>
+      <w:r>
+        <w:t xml:space="preserve"> </w:t>
+      </w:r>
+      <w:r>
+        <w:rPr>
+          <w:rStyle w:val="VerbatimChar"/>
+        </w:rPr>
+        <w:t xml:space="preserve">server-side-fallback-2026-07-01</w:t>
+      </w:r>
+      <w:r>
+        <w:t xml:space="preserve">; він сам добирає модель за категорією відмови, без ручного списку. Недоступний на Batch API, Bedrock, Google Cloud і Foundry — там роби ретрай на клієнті.</w:t>
       </w:r>
     </w:p>
     <w:p>
@@ -23805,7 +23832,34 @@
         <w:t xml:space="preserve"> </w:t>
       </w:r>
       <w:r>
-        <w:t xml:space="preserve">+ fallback.</w:t>
+        <w:t xml:space="preserve">+</w:t>
+      </w:r>
+      <w:r>
+        <w:t xml:space="preserve"> </w:t>
+      </w:r>
+      <w:r>
+        <w:rPr>
+          <w:rStyle w:val="VerbatimChar"/>
+        </w:rPr>
+        <w:t xml:space="preserve">fallbacks: "default"</w:t>
+      </w:r>
+      <w:r>
+        <w:t xml:space="preserve"> </w:t>
+      </w:r>
+      <w:r>
+        <w:t xml:space="preserve">(бета</w:t>
+      </w:r>
+      <w:r>
+        <w:t xml:space="preserve"> </w:t>
+      </w:r>
+      <w:r>
+        <w:rPr>
+          <w:rStyle w:val="VerbatimChar"/>
+        </w:rPr>
+        <w:t xml:space="preserve">server-side-fallback-2026-07-01</w:t>
+      </w:r>
+      <w:r>
+        <w:t xml:space="preserve">).</w:t>
       </w:r>
     </w:p>
     <w:p>
@@ -25055,7 +25109,28 @@
         <w:t xml:space="preserve"> </w:t>
       </w:r>
       <w:r>
-        <w:t xml:space="preserve">+ fallback на Opus 4.8.</w:t>
+        <w:t xml:space="preserve">+ server-side fallback (</w:t>
+      </w:r>
+      <w:r>
+        <w:rPr>
+          <w:rStyle w:val="VerbatimChar"/>
+        </w:rPr>
+        <w:t xml:space="preserve">fallbacks: "default"</w:t>
+      </w:r>
+      <w:r>
+        <w:t xml:space="preserve">, бета</w:t>
+      </w:r>
+      <w:r>
+        <w:t xml:space="preserve"> </w:t>
+      </w:r>
+      <w:r>
+        <w:rPr>
+          <w:rStyle w:val="VerbatimChar"/>
+        </w:rPr>
+        <w:t xml:space="preserve">server-side-fallback-2026-07-01</w:t>
+      </w:r>
+      <w:r>
+        <w:t xml:space="preserve">).</w:t>
       </w:r>
     </w:p>
     <w:p>

</xml_diff>